<commit_message>
Calibrate EdgeConv P80 threshold and update results
</commit_message>
<xml_diff>
--- a/manuscript/saimm_manuscript.docx
+++ b/manuscript/saimm_manuscript.docx
@@ -59,7 +59,7 @@
         <w:jc w:val="left"/>
       </w:pPr>
       <w:r>
-        <w:t>Post-blast rockpile fragmentation controls loading, hauling, and crushing performance, but field point clouds rarely provide fragment-level labels or independent size references. This study presents a synthetic benchmark for exterior rockpile point clouds in which individual rock-like fragments are generated first, assembled into labelled piles, filtered to retain only visible exterior points, and then used to compare fragment clustering methods. A graph EdgeConv model predicts whether neighbouring exterior points belong to the same fragment, and thresholded edge affinities are converted into connected components and visible-surface particle-size proxies. The same 100 scenes, each containing 150 fragments, were used for all methods with a 60:20:20 train, validation, and test split. The latest held-out comparison showed that a calibrated graph-threshold rule gave the lowest mean absolute eighty per cent passing-size error, 14.37 per cent, while EdgeConv with post-splitting gave 19.04 per cent and retained stronger learned local affinity information than the shallow multilayer perceptron. The results show that synthetic exterior piles can separate two questions that are often conflated in rockpile monitoring: whether visible fragments are cleanly segmented, and whether the resulting surface clusters recover a useful size-distribution proxy. The benchmark is intended as a reproducible pre-field testbed rather than a replacement for mine-site calibration.</w:t>
+        <w:t>Post-blast rockpile fragmentation controls loading, hauling, and crushing performance, but field point clouds rarely provide fragment-level labels or independent size references. This study presents a synthetic benchmark for exterior rockpile point clouds in which individual rock-like fragments are generated first, assembled into labelled piles, filtered to retain only visible exterior points, and then used to compare fragment clustering methods. A graph EdgeConv model predicts whether neighbouring exterior points belong to the same fragment, and thresholded edge affinities are converted into connected components and visible-surface particle-size proxies. The same 100 scenes, each containing 150 fragments, were used for all methods with a 60:20:20 train, validation, and test split. The latest held-out comparison showed that EdgeConv with fine high-threshold post-splitting gave the lowest mean absolute eighty per cent passing-size error, 12.40 per cent, compared with 14.37 per cent for the calibrated graph-threshold rule. This gain came with a high noise fraction, so the results show that synthetic exterior piles can separate two questions that are often conflated in rockpile monitoring: whether visible fragments are cleanly segmented, and whether the resulting surface clusters recover a useful size-distribution proxy. The benchmark is intended as a reproducible pre-field testbed rather than a replacement for mine-site calibration.</w:t>
       </w:r>
     </w:p>
     <w:p>
@@ -2480,7 +2480,7 @@
         <w:jc w:val="left"/>
       </w:pPr>
       <w:r>
-        <w:t>The 24-epoch EdgeConv run showed improving training loss and high validation average precision, confirming that the model learned informative same-fragment edge affinities. The remaining difficulty was calibration of the affinity threshold and post-processing for realistic exterior piles, where overly strict thresholds split visible fragments into too many components.</w:t>
+        <w:t>The 12-epoch EdgeConv calibration run showed improving training loss and high validation average precision, confirming that the model learned informative same-fragment edge affinities. The remaining difficulty was calibration of the affinity threshold and post-processing for realistic exterior piles, where overly strict thresholds split visible fragments into too many components.</w:t>
       </w:r>
     </w:p>
     <w:p>
@@ -2490,7 +2490,7 @@
       <w:r>
         <w:drawing>
           <wp:inline xmlns:a="http://schemas.openxmlformats.org/drawingml/2006/main" xmlns:pic="http://schemas.openxmlformats.org/drawingml/2006/picture">
-            <wp:extent cx="5220000" cy="3100031"/>
+            <wp:extent cx="5220000" cy="3097535"/>
             <wp:docPr id="6" name="Picture 6"/>
             <wp:cNvGraphicFramePr>
               <a:graphicFrameLocks noChangeAspect="1"/>
@@ -2511,7 +2511,7 @@
                   <pic:spPr>
                     <a:xfrm>
                       <a:off x="0" y="0"/>
-                      <a:ext cx="5220000" cy="3100031"/>
+                      <a:ext cx="5220000" cy="3097535"/>
                     </a:xfrm>
                     <a:prstGeom prst="rect"/>
                   </pic:spPr>
@@ -2535,7 +2535,7 @@
         <w:t xml:space="preserve">Figure 6. </w:t>
       </w:r>
       <w:r>
-        <w:t>Training loss and validation average precision for the 24-epoch EdgeConv edge-affinity run</w:t>
+        <w:t>Training loss and validation average precision for the 12-epoch EdgeConv edge-affinity calibration run</w:t>
       </w:r>
     </w:p>
     <w:p>
@@ -2804,7 +2804,7 @@
                 <w:rFonts w:ascii="Arial" w:hAnsi="Arial" w:eastAsia="Arial"/>
                 <w:sz w:val="18"/>
               </w:rPr>
-              <w:t>0.997</w:t>
+              <w:t>1.000</w:t>
             </w:r>
           </w:p>
         </w:tc>
@@ -2828,7 +2828,7 @@
                 <w:rFonts w:ascii="Arial" w:hAnsi="Arial" w:eastAsia="Arial"/>
                 <w:sz w:val="18"/>
               </w:rPr>
-              <w:t>19.04</w:t>
+              <w:t>12.40</w:t>
             </w:r>
           </w:p>
         </w:tc>
@@ -2852,7 +2852,7 @@
                 <w:rFonts w:ascii="Arial" w:hAnsi="Arial" w:eastAsia="Arial"/>
                 <w:sz w:val="18"/>
               </w:rPr>
-              <w:t>18.36</w:t>
+              <w:t>13.32</w:t>
             </w:r>
           </w:p>
         </w:tc>
@@ -2876,7 +2876,7 @@
                 <w:rFonts w:ascii="Arial" w:hAnsi="Arial" w:eastAsia="Arial"/>
                 <w:sz w:val="18"/>
               </w:rPr>
-              <w:t>0.492</w:t>
+              <w:t>0.229</w:t>
             </w:r>
           </w:p>
         </w:tc>
@@ -2900,7 +2900,7 @@
                 <w:rFonts w:ascii="Arial" w:hAnsi="Arial" w:eastAsia="Arial"/>
                 <w:sz w:val="18"/>
               </w:rPr>
-              <w:t>0.032</w:t>
+              <w:t>0.000</w:t>
             </w:r>
           </w:p>
         </w:tc>
@@ -2924,7 +2924,7 @@
                 <w:rFonts w:ascii="Arial" w:hAnsi="Arial" w:eastAsia="Arial"/>
                 <w:sz w:val="18"/>
               </w:rPr>
-              <w:t>0.603</w:t>
+              <w:t>0.831</w:t>
             </w:r>
           </w:p>
         </w:tc>
@@ -2974,7 +2974,7 @@
                 <w:rFonts w:ascii="Arial" w:hAnsi="Arial" w:eastAsia="Arial"/>
                 <w:sz w:val="18"/>
               </w:rPr>
-              <w:t>0.997</w:t>
+              <w:t>1.000</w:t>
             </w:r>
           </w:p>
         </w:tc>
@@ -2998,7 +2998,7 @@
                 <w:rFonts w:ascii="Arial" w:hAnsi="Arial" w:eastAsia="Arial"/>
                 <w:sz w:val="18"/>
               </w:rPr>
-              <w:t>20.82</w:t>
+              <w:t>12.90</w:t>
             </w:r>
           </w:p>
         </w:tc>
@@ -3022,7 +3022,7 @@
                 <w:rFonts w:ascii="Arial" w:hAnsi="Arial" w:eastAsia="Arial"/>
                 <w:sz w:val="18"/>
               </w:rPr>
-              <w:t>19.42</w:t>
+              <w:t>13.32</w:t>
             </w:r>
           </w:p>
         </w:tc>
@@ -3046,7 +3046,7 @@
                 <w:rFonts w:ascii="Arial" w:hAnsi="Arial" w:eastAsia="Arial"/>
                 <w:sz w:val="18"/>
               </w:rPr>
-              <w:t>0.492</w:t>
+              <w:t>0.230</w:t>
             </w:r>
           </w:p>
         </w:tc>
@@ -3070,7 +3070,7 @@
                 <w:rFonts w:ascii="Arial" w:hAnsi="Arial" w:eastAsia="Arial"/>
                 <w:sz w:val="18"/>
               </w:rPr>
-              <w:t>0.034</w:t>
+              <w:t>0.001</w:t>
             </w:r>
           </w:p>
         </w:tc>
@@ -3094,7 +3094,7 @@
                 <w:rFonts w:ascii="Arial" w:hAnsi="Arial" w:eastAsia="Arial"/>
                 <w:sz w:val="18"/>
               </w:rPr>
-              <w:t>0.603</w:t>
+              <w:t>0.831</w:t>
             </w:r>
           </w:p>
         </w:tc>
@@ -3144,7 +3144,7 @@
                 <w:rFonts w:ascii="Arial" w:hAnsi="Arial" w:eastAsia="Arial"/>
                 <w:sz w:val="18"/>
               </w:rPr>
-              <w:t>0.997</w:t>
+              <w:t>1.000</w:t>
             </w:r>
           </w:p>
         </w:tc>
@@ -3168,7 +3168,7 @@
                 <w:rFonts w:ascii="Arial" w:hAnsi="Arial" w:eastAsia="Arial"/>
                 <w:sz w:val="18"/>
               </w:rPr>
-              <w:t>21.84</w:t>
+              <w:t>17.41</w:t>
             </w:r>
           </w:p>
         </w:tc>
@@ -3192,7 +3192,7 @@
                 <w:rFonts w:ascii="Arial" w:hAnsi="Arial" w:eastAsia="Arial"/>
                 <w:sz w:val="18"/>
               </w:rPr>
-              <w:t>21.40</w:t>
+              <w:t>16.56</w:t>
             </w:r>
           </w:p>
         </w:tc>
@@ -3216,7 +3216,7 @@
                 <w:rFonts w:ascii="Arial" w:hAnsi="Arial" w:eastAsia="Arial"/>
                 <w:sz w:val="18"/>
               </w:rPr>
-              <w:t>0.597</w:t>
+              <w:t>0.407</w:t>
             </w:r>
           </w:p>
         </w:tc>
@@ -3240,7 +3240,7 @@
                 <w:rFonts w:ascii="Arial" w:hAnsi="Arial" w:eastAsia="Arial"/>
                 <w:sz w:val="18"/>
               </w:rPr>
-              <w:t>0.070</w:t>
+              <w:t>0.021</w:t>
             </w:r>
           </w:p>
         </w:tc>
@@ -3264,7 +3264,7 @@
                 <w:rFonts w:ascii="Arial" w:hAnsi="Arial" w:eastAsia="Arial"/>
                 <w:sz w:val="18"/>
               </w:rPr>
-              <w:t>0.506</w:t>
+              <w:t>0.694</w:t>
             </w:r>
           </w:p>
         </w:tc>
@@ -3314,7 +3314,7 @@
                 <w:rFonts w:ascii="Arial" w:hAnsi="Arial" w:eastAsia="Arial"/>
                 <w:sz w:val="18"/>
               </w:rPr>
-              <w:t>0.997</w:t>
+              <w:t>1.000</w:t>
             </w:r>
           </w:p>
         </w:tc>
@@ -3338,7 +3338,7 @@
                 <w:rFonts w:ascii="Arial" w:hAnsi="Arial" w:eastAsia="Arial"/>
                 <w:sz w:val="18"/>
               </w:rPr>
-              <w:t>23.45</w:t>
+              <w:t>19.85</w:t>
             </w:r>
           </w:p>
         </w:tc>
@@ -3362,7 +3362,7 @@
                 <w:rFonts w:ascii="Arial" w:hAnsi="Arial" w:eastAsia="Arial"/>
                 <w:sz w:val="18"/>
               </w:rPr>
-              <w:t>21.40</w:t>
+              <w:t>17.11</w:t>
             </w:r>
           </w:p>
         </w:tc>
@@ -3386,7 +3386,7 @@
                 <w:rFonts w:ascii="Arial" w:hAnsi="Arial" w:eastAsia="Arial"/>
                 <w:sz w:val="18"/>
               </w:rPr>
-              <w:t>0.597</w:t>
+              <w:t>0.408</w:t>
             </w:r>
           </w:p>
         </w:tc>
@@ -3410,7 +3410,7 @@
                 <w:rFonts w:ascii="Arial" w:hAnsi="Arial" w:eastAsia="Arial"/>
                 <w:sz w:val="18"/>
               </w:rPr>
-              <w:t>0.073</w:t>
+              <w:t>0.023</w:t>
             </w:r>
           </w:p>
         </w:tc>
@@ -3434,7 +3434,7 @@
                 <w:rFonts w:ascii="Arial" w:hAnsi="Arial" w:eastAsia="Arial"/>
                 <w:sz w:val="18"/>
               </w:rPr>
-              <w:t>0.506</w:t>
+              <w:t>0.694</w:t>
             </w:r>
           </w:p>
         </w:tc>
@@ -3663,6 +3663,176 @@
                 <w:sz w:val="18"/>
               </w:rPr>
               <w:t>Noise</w:t>
+            </w:r>
+          </w:p>
+        </w:tc>
+      </w:tr>
+      <w:tr>
+        <w:tc>
+          <w:tcPr>
+            <w:tcW w:type="dxa" w:w="1500"/>
+            <w:tcMar>
+              <w:top w:w="80" w:type="dxa"/>
+              <w:start w:w="120" w:type="dxa"/>
+              <w:bottom w:w="80" w:type="dxa"/>
+              <w:end w:w="120" w:type="dxa"/>
+            </w:tcMar>
+            <w:vAlign w:val="center"/>
+          </w:tcPr>
+          <w:p>
+            <w:pPr>
+              <w:spacing w:line="276" w:lineRule="auto" w:after="0"/>
+            </w:pPr>
+            <w:r>
+              <w:rPr>
+                <w:rFonts w:ascii="Arial" w:hAnsi="Arial" w:eastAsia="Arial"/>
+                <w:sz w:val="18"/>
+              </w:rPr>
+              <w:t>EdgeConv post split</w:t>
+            </w:r>
+          </w:p>
+        </w:tc>
+        <w:tc>
+          <w:tcPr>
+            <w:tcW w:type="dxa" w:w="2600"/>
+            <w:tcMar>
+              <w:top w:w="80" w:type="dxa"/>
+              <w:start w:w="120" w:type="dxa"/>
+              <w:bottom w:w="80" w:type="dxa"/>
+              <w:end w:w="120" w:type="dxa"/>
+            </w:tcMar>
+            <w:vAlign w:val="center"/>
+          </w:tcPr>
+          <w:p>
+            <w:pPr>
+              <w:spacing w:line="276" w:lineRule="auto" w:after="0"/>
+            </w:pPr>
+            <w:r>
+              <w:rPr>
+                <w:rFonts w:ascii="Arial" w:hAnsi="Arial" w:eastAsia="Arial"/>
+                <w:sz w:val="18"/>
+              </w:rPr>
+              <w:t>threshold=0.9995</w:t>
+            </w:r>
+          </w:p>
+        </w:tc>
+        <w:tc>
+          <w:tcPr>
+            <w:tcW w:type="dxa" w:w="1300"/>
+            <w:tcMar>
+              <w:top w:w="80" w:type="dxa"/>
+              <w:start w:w="120" w:type="dxa"/>
+              <w:bottom w:w="80" w:type="dxa"/>
+              <w:end w:w="120" w:type="dxa"/>
+            </w:tcMar>
+            <w:vAlign w:val="center"/>
+          </w:tcPr>
+          <w:p>
+            <w:pPr>
+              <w:spacing w:line="276" w:lineRule="auto" w:after="0"/>
+            </w:pPr>
+            <w:r>
+              <w:rPr>
+                <w:rFonts w:ascii="Arial" w:hAnsi="Arial" w:eastAsia="Arial"/>
+                <w:sz w:val="18"/>
+              </w:rPr>
+              <w:t>12.40</w:t>
+            </w:r>
+          </w:p>
+        </w:tc>
+        <w:tc>
+          <w:tcPr>
+            <w:tcW w:type="dxa" w:w="1300"/>
+            <w:tcMar>
+              <w:top w:w="80" w:type="dxa"/>
+              <w:start w:w="120" w:type="dxa"/>
+              <w:bottom w:w="80" w:type="dxa"/>
+              <w:end w:w="120" w:type="dxa"/>
+            </w:tcMar>
+            <w:vAlign w:val="center"/>
+          </w:tcPr>
+          <w:p>
+            <w:pPr>
+              <w:spacing w:line="276" w:lineRule="auto" w:after="0"/>
+            </w:pPr>
+            <w:r>
+              <w:rPr>
+                <w:rFonts w:ascii="Arial" w:hAnsi="Arial" w:eastAsia="Arial"/>
+                <w:sz w:val="18"/>
+              </w:rPr>
+              <w:t>13.32</w:t>
+            </w:r>
+          </w:p>
+        </w:tc>
+        <w:tc>
+          <w:tcPr>
+            <w:tcW w:type="dxa" w:w="900"/>
+            <w:tcMar>
+              <w:top w:w="80" w:type="dxa"/>
+              <w:start w:w="120" w:type="dxa"/>
+              <w:bottom w:w="80" w:type="dxa"/>
+              <w:end w:w="120" w:type="dxa"/>
+            </w:tcMar>
+            <w:vAlign w:val="center"/>
+          </w:tcPr>
+          <w:p>
+            <w:pPr>
+              <w:spacing w:line="276" w:lineRule="auto" w:after="0"/>
+            </w:pPr>
+            <w:r>
+              <w:rPr>
+                <w:rFonts w:ascii="Arial" w:hAnsi="Arial" w:eastAsia="Arial"/>
+                <w:sz w:val="18"/>
+              </w:rPr>
+              <w:t>0.229</w:t>
+            </w:r>
+          </w:p>
+        </w:tc>
+        <w:tc>
+          <w:tcPr>
+            <w:tcW w:type="dxa" w:w="900"/>
+            <w:tcMar>
+              <w:top w:w="80" w:type="dxa"/>
+              <w:start w:w="120" w:type="dxa"/>
+              <w:bottom w:w="80" w:type="dxa"/>
+              <w:end w:w="120" w:type="dxa"/>
+            </w:tcMar>
+            <w:vAlign w:val="center"/>
+          </w:tcPr>
+          <w:p>
+            <w:pPr>
+              <w:spacing w:line="276" w:lineRule="auto" w:after="0"/>
+            </w:pPr>
+            <w:r>
+              <w:rPr>
+                <w:rFonts w:ascii="Arial" w:hAnsi="Arial" w:eastAsia="Arial"/>
+                <w:sz w:val="18"/>
+              </w:rPr>
+              <w:t>0.000</w:t>
+            </w:r>
+          </w:p>
+        </w:tc>
+        <w:tc>
+          <w:tcPr>
+            <w:tcW w:type="dxa" w:w="860"/>
+            <w:tcMar>
+              <w:top w:w="80" w:type="dxa"/>
+              <w:start w:w="120" w:type="dxa"/>
+              <w:bottom w:w="80" w:type="dxa"/>
+              <w:end w:w="120" w:type="dxa"/>
+            </w:tcMar>
+            <w:vAlign w:val="center"/>
+          </w:tcPr>
+          <w:p>
+            <w:pPr>
+              <w:spacing w:line="276" w:lineRule="auto" w:after="0"/>
+            </w:pPr>
+            <w:r>
+              <w:rPr>
+                <w:rFonts w:ascii="Arial" w:hAnsi="Arial" w:eastAsia="Arial"/>
+                <w:sz w:val="18"/>
+              </w:rPr>
+              <w:t>0.831</w:t>
             </w:r>
           </w:p>
         </w:tc>
@@ -4198,176 +4368,6 @@
                 <w:rFonts w:ascii="Arial" w:hAnsi="Arial" w:eastAsia="Arial"/>
                 <w:sz w:val="18"/>
               </w:rPr>
-              <w:t>EdgeConv post split</w:t>
-            </w:r>
-          </w:p>
-        </w:tc>
-        <w:tc>
-          <w:tcPr>
-            <w:tcW w:type="dxa" w:w="2600"/>
-            <w:tcMar>
-              <w:top w:w="80" w:type="dxa"/>
-              <w:start w:w="120" w:type="dxa"/>
-              <w:bottom w:w="80" w:type="dxa"/>
-              <w:end w:w="120" w:type="dxa"/>
-            </w:tcMar>
-            <w:vAlign w:val="center"/>
-          </w:tcPr>
-          <w:p>
-            <w:pPr>
-              <w:spacing w:line="276" w:lineRule="auto" w:after="0"/>
-            </w:pPr>
-            <w:r>
-              <w:rPr>
-                <w:rFonts w:ascii="Arial" w:hAnsi="Arial" w:eastAsia="Arial"/>
-                <w:sz w:val="18"/>
-              </w:rPr>
-              <w:t>threshold=0.997</w:t>
-            </w:r>
-          </w:p>
-        </w:tc>
-        <w:tc>
-          <w:tcPr>
-            <w:tcW w:type="dxa" w:w="1300"/>
-            <w:tcMar>
-              <w:top w:w="80" w:type="dxa"/>
-              <w:start w:w="120" w:type="dxa"/>
-              <w:bottom w:w="80" w:type="dxa"/>
-              <w:end w:w="120" w:type="dxa"/>
-            </w:tcMar>
-            <w:vAlign w:val="center"/>
-          </w:tcPr>
-          <w:p>
-            <w:pPr>
-              <w:spacing w:line="276" w:lineRule="auto" w:after="0"/>
-            </w:pPr>
-            <w:r>
-              <w:rPr>
-                <w:rFonts w:ascii="Arial" w:hAnsi="Arial" w:eastAsia="Arial"/>
-                <w:sz w:val="18"/>
-              </w:rPr>
-              <w:t>19.04</w:t>
-            </w:r>
-          </w:p>
-        </w:tc>
-        <w:tc>
-          <w:tcPr>
-            <w:tcW w:type="dxa" w:w="1300"/>
-            <w:tcMar>
-              <w:top w:w="80" w:type="dxa"/>
-              <w:start w:w="120" w:type="dxa"/>
-              <w:bottom w:w="80" w:type="dxa"/>
-              <w:end w:w="120" w:type="dxa"/>
-            </w:tcMar>
-            <w:vAlign w:val="center"/>
-          </w:tcPr>
-          <w:p>
-            <w:pPr>
-              <w:spacing w:line="276" w:lineRule="auto" w:after="0"/>
-            </w:pPr>
-            <w:r>
-              <w:rPr>
-                <w:rFonts w:ascii="Arial" w:hAnsi="Arial" w:eastAsia="Arial"/>
-                <w:sz w:val="18"/>
-              </w:rPr>
-              <w:t>18.36</w:t>
-            </w:r>
-          </w:p>
-        </w:tc>
-        <w:tc>
-          <w:tcPr>
-            <w:tcW w:type="dxa" w:w="900"/>
-            <w:tcMar>
-              <w:top w:w="80" w:type="dxa"/>
-              <w:start w:w="120" w:type="dxa"/>
-              <w:bottom w:w="80" w:type="dxa"/>
-              <w:end w:w="120" w:type="dxa"/>
-            </w:tcMar>
-            <w:vAlign w:val="center"/>
-          </w:tcPr>
-          <w:p>
-            <w:pPr>
-              <w:spacing w:line="276" w:lineRule="auto" w:after="0"/>
-            </w:pPr>
-            <w:r>
-              <w:rPr>
-                <w:rFonts w:ascii="Arial" w:hAnsi="Arial" w:eastAsia="Arial"/>
-                <w:sz w:val="18"/>
-              </w:rPr>
-              <w:t>0.492</w:t>
-            </w:r>
-          </w:p>
-        </w:tc>
-        <w:tc>
-          <w:tcPr>
-            <w:tcW w:type="dxa" w:w="900"/>
-            <w:tcMar>
-              <w:top w:w="80" w:type="dxa"/>
-              <w:start w:w="120" w:type="dxa"/>
-              <w:bottom w:w="80" w:type="dxa"/>
-              <w:end w:w="120" w:type="dxa"/>
-            </w:tcMar>
-            <w:vAlign w:val="center"/>
-          </w:tcPr>
-          <w:p>
-            <w:pPr>
-              <w:spacing w:line="276" w:lineRule="auto" w:after="0"/>
-            </w:pPr>
-            <w:r>
-              <w:rPr>
-                <w:rFonts w:ascii="Arial" w:hAnsi="Arial" w:eastAsia="Arial"/>
-                <w:sz w:val="18"/>
-              </w:rPr>
-              <w:t>0.032</w:t>
-            </w:r>
-          </w:p>
-        </w:tc>
-        <w:tc>
-          <w:tcPr>
-            <w:tcW w:type="dxa" w:w="860"/>
-            <w:tcMar>
-              <w:top w:w="80" w:type="dxa"/>
-              <w:start w:w="120" w:type="dxa"/>
-              <w:bottom w:w="80" w:type="dxa"/>
-              <w:end w:w="120" w:type="dxa"/>
-            </w:tcMar>
-            <w:vAlign w:val="center"/>
-          </w:tcPr>
-          <w:p>
-            <w:pPr>
-              <w:spacing w:line="276" w:lineRule="auto" w:after="0"/>
-            </w:pPr>
-            <w:r>
-              <w:rPr>
-                <w:rFonts w:ascii="Arial" w:hAnsi="Arial" w:eastAsia="Arial"/>
-                <w:sz w:val="18"/>
-              </w:rPr>
-              <w:t>0.603</w:t>
-            </w:r>
-          </w:p>
-        </w:tc>
-      </w:tr>
-      <w:tr>
-        <w:tc>
-          <w:tcPr>
-            <w:tcW w:type="dxa" w:w="1500"/>
-            <w:tcMar>
-              <w:top w:w="80" w:type="dxa"/>
-              <w:start w:w="120" w:type="dxa"/>
-              <w:bottom w:w="80" w:type="dxa"/>
-              <w:end w:w="120" w:type="dxa"/>
-            </w:tcMar>
-            <w:vAlign w:val="center"/>
-          </w:tcPr>
-          <w:p>
-            <w:pPr>
-              <w:spacing w:line="276" w:lineRule="auto" w:after="0"/>
-            </w:pPr>
-            <w:r>
-              <w:rPr>
-                <w:rFonts w:ascii="Arial" w:hAnsi="Arial" w:eastAsia="Arial"/>
-                <w:sz w:val="18"/>
-              </w:rPr>
               <w:t>Region growing</w:t>
             </w:r>
           </w:p>
@@ -4531,7 +4531,7 @@
       <w:r>
         <w:drawing>
           <wp:inline xmlns:a="http://schemas.openxmlformats.org/drawingml/2006/main" xmlns:pic="http://schemas.openxmlformats.org/drawingml/2006/picture">
-            <wp:extent cx="5040000" cy="2663236"/>
+            <wp:extent cx="5040000" cy="3028924"/>
             <wp:docPr id="7" name="Picture 7"/>
             <wp:cNvGraphicFramePr>
               <a:graphicFrameLocks noChangeAspect="1"/>
@@ -4552,7 +4552,7 @@
                   <pic:spPr>
                     <a:xfrm>
                       <a:off x="0" y="0"/>
-                      <a:ext cx="5040000" cy="2663236"/>
+                      <a:ext cx="5040000" cy="3028924"/>
                     </a:xfrm>
                     <a:prstGeom prst="rect"/>
                   </pic:spPr>
@@ -4650,7 +4650,7 @@
         <w:jc w:val="left"/>
       </w:pPr>
       <w:r>
-        <w:t>The results suggest that the benchmark is diagnosing two separate behaviours. EdgeConv learns useful edge affinity, as indicated by the training curve and validation average precision, but the final size proxy is sensitive to the probability threshold and component rules. In the latest realistic-pile setting, very high thresholds tend to cut components into many small pieces, raising the noise fraction and damaging the coarse size estimate. This explains why a calibrated graph-threshold rule can outperform the neural model on P80 error even though the neural model has learned a meaningful local affinity function.</w:t>
+        <w:t>The results suggest that the benchmark is diagnosing two separate behaviours. EdgeConv learns useful edge affinity, as indicated by the training curve and validation average precision, but the final size proxy is sensitive to the probability threshold and component rules. In the latest realistic-pile setting, a fine high-threshold sweep let EdgeConv outperform the calibrated graph-threshold rule on P80 error. However, this setting also cut the surface into many small components and produced a high noise fraction, so it should be interpreted as P80-oriented calibration rather than clean fragment segmentation.</w:t>
       </w:r>
     </w:p>
     <w:p>

</xml_diff>